<commit_message>
fix: refine last stand and shop interactions
</commit_message>
<xml_diff>
--- a/docs/user-guides/14_阵营锁定10队金币商店模式_实施规范.docx
+++ b/docs/user-guides/14_阵营锁定10队金币商店模式_实施规范.docx
@@ -4749,10 +4749,7 @@
         <w:pStyle w:val="ListBullet"/>
       </w:pPr>
       <w:r>
-        <w:rPr>
-          <w:rFonts w:ascii="Microsoft YaHei" w:hAnsi="Microsoft YaHei" w:eastAsia="Microsoft YaHei"/>
-        </w:rPr>
-        <w:t>发动成功后消耗本轮购买权，并标记该海克斯已使用。</w:t>
+        <w:t>发动条件不检查本轮购买权；队长已经购买、已跳过或因其它规则没有购买权时，只要仍有 4 名队员且本阵营合法候选足够，仍可发动。发动成功后只标记该海克斯已使用，不消耗购买权；队伍满 4 人时购买权自然失效。</w:t>
       </w:r>
     </w:p>
     <w:p>
@@ -4783,7 +4780,7 @@
         <w:rPr>
           <w:rFonts w:ascii="Microsoft YaHei" w:hAnsi="Microsoft YaHei" w:eastAsia="Microsoft YaHei"/>
         </w:rPr>
-        <w:t>本轮已经购买或跳过。</w:t>
+        <w:t>本阵营合法候选不足 4 人。</w:t>
       </w:r>
     </w:p>
     <w:p>
@@ -4794,7 +4791,7 @@
         <w:rPr>
           <w:rFonts w:ascii="Microsoft YaHei" w:hAnsi="Microsoft YaHei" w:eastAsia="Microsoft YaHei"/>
         </w:rPr>
-        <w:t>本阵营合法候选不足 4 人。</w:t>
+        <w:t>目标候选或补偿会造成跨阵营入队。</w:t>
       </w:r>
     </w:p>
     <w:p>
@@ -4805,7 +4802,16 @@
         <w:rPr>
           <w:rFonts w:ascii="Microsoft YaHei" w:hAnsi="Microsoft YaHei" w:eastAsia="Microsoft YaHei"/>
         </w:rPr>
-        <w:t>目标候选或补偿会造成跨阵营入队。</w:t>
+        <w:t>候选来自持有 海浪，我没吃饭 队伍当前阵容。</w:t>
+      </w:r>
+    </w:p>
+    <w:p>
+      <w:pPr/>
+      <w:r>
+        <w:rPr>
+          <w:rFonts w:ascii="Microsoft YaHei" w:hAnsi="Microsoft YaHei" w:eastAsia="Microsoft YaHei"/>
+        </w:rPr>
+        <w:t>顺位约束：</w:t>
       </w:r>
     </w:p>
     <w:p>
@@ -4816,16 +4822,7 @@
         <w:rPr>
           <w:rFonts w:ascii="Microsoft YaHei" w:hAnsi="Microsoft YaHei" w:eastAsia="Microsoft YaHei"/>
         </w:rPr>
-        <w:t>候选来自持有 海浪，我没吃饭 队伍当前阵容。</w:t>
-      </w:r>
-    </w:p>
-    <w:p>
-      <w:pPr/>
-      <w:r>
-        <w:rPr>
-          <w:rFonts w:ascii="Microsoft YaHei" w:hAnsi="Microsoft YaHei" w:eastAsia="Microsoft YaHei"/>
-        </w:rPr>
-        <w:t>顺位约束：</w:t>
+        <w:t>背水一战 不产生任何顺位效果。</w:t>
       </w:r>
     </w:p>
     <w:p>
@@ -4833,21 +4830,7 @@
         <w:pStyle w:val="ListBullet"/>
       </w:pPr>
       <w:r>
-        <w:rPr>
-          <w:rFonts w:ascii="Microsoft YaHei" w:hAnsi="Microsoft YaHei" w:eastAsia="Microsoft YaHei"/>
-        </w:rPr>
-        <w:t>背水一战 不产生任何顺位效果。</w:t>
-      </w:r>
-    </w:p>
-    <w:p>
-      <w:pPr>
-        <w:pStyle w:val="ListBullet"/>
-      </w:pPr>
-      <w:r>
-        <w:rPr>
-          <w:rFonts w:ascii="Microsoft YaHei" w:hAnsi="Microsoft YaHei" w:eastAsia="Microsoft YaHei"/>
-        </w:rPr>
-        <w:t>队伍满员通常会从本轮顺位中移除；但如果该队长满足 背水一战 发动条件，仍必须保留在本轮顺位中，直到发动、跳过、购买权结束或候选不足。</w:t>
+        <w:t>队伍满员通常会从本轮顺位中移除；但如果该队长满足 背水一战 发动条件，仍必须保留在本轮顺位中，直到发动、该海克斯已使用或候选不足；该保留窗口不受购买权状态限制。</w:t>
       </w:r>
     </w:p>
     <w:p>

</xml_diff>